<commit_message>
style: remove 'somatic' and complex jargon, replace with warm natural human terms (телесное напряжение, покой, опора)
</commit_message>
<xml_diff>
--- a/baza/исходник миникурса/ПОЛНЫЕ_ДОСЛОВНЫЕ_СЦЕНАРИИ_МЕДИТАЦИЙ_МАГИГ.docx
+++ b/baza/исходник миникурса/ПОЛНЫЕ_ДОСЛОВНЫЕ_СЦЕНАРИИ_МЕДИТАЦИЙ_МАГИГ.docx
@@ -14,7 +14,7 @@
           <w:color w:val="1F4E5B"/>
           <w:sz w:val="36"/>
         </w:rPr>
-        <w:t>ПОЛНЫЕ ДОСЛОВНЫЕ ТЕКСТЫ АУДИОМЕДИТАЦИЙ И ГИПНОПРАКТИК</w:t>
+        <w:t>ПОЛНЫЕ ДОСЛОВНЫЕ ТЕКСТЫ АУДИОМЕДИТАЦИЙ И ПРАКТИК ПОКОЯ</w:t>
       </w:r>
     </w:p>
     <w:p>
@@ -29,7 +29,7 @@
           <w:color w:val="555555"/>
           <w:sz w:val="22"/>
         </w:rPr>
-        <w:t>Профессиональные протоколы наведения транса, соматического заземления и десенсибилизации</w:t>
+        <w:t>Пошаговые тексты для начитки под микрофон и музыку</w:t>
         <w:br/>
         <w:t>Спикер: Федоров Анатолий Игоревич (Семейный психолог, гипнолог, проректор МАГиГ)</w:t>
       </w:r>
@@ -45,7 +45,7 @@
           <w:color w:val="1F4E5B"/>
           <w:sz w:val="28"/>
         </w:rPr>
-        <w:t>🎧 МЕДИТАЦИЯ 1: «ЭКСТРЕННОЕ СОМАТИЧЕСКОЕ ЗАЗЕМЛЕНИЕ: ВОЗВРАЩЕНИЕ ПОЧВЫ ПОД НОГАМИ»</w:t>
+        <w:t>🎧 МЕДИТАЦИЯ 1: «ЭКСТРЕННОЕ ЗАЗЕМЛЕНИЕ: ВОЗВРАЩЕНИЕ ПОЧВЫ ПОД НОГАМИ»</w:t>
       </w:r>
     </w:p>
     <w:p>
@@ -60,7 +60,7 @@
           <w:color w:val="C0392B"/>
           <w:sz w:val="20"/>
         </w:rPr>
-        <w:t>ПАРАМЕТРЫ ЗАПИСИ И НАВЕДЕНИЯ</w:t>
+        <w:t>ПАРАМЕТРЫ ЗАПИСИ</w:t>
         <w:br/>
       </w:r>
       <w:r>
@@ -68,13 +68,11 @@
           <w:rFonts w:ascii="Calibri" w:hAnsi="Calibri"/>
           <w:sz w:val="19"/>
         </w:rPr>
-        <w:t>• Точный хронометраж начитки: 8–9 минут (медленный гипнотический темп, 70-80 слов в минуту).</w:t>
+        <w:t>• Длительность: 8–9 мин.</w:t>
         <w:br/>
-        <w:t>• Музыка FlowMusic: bg_grounding_emergency.mp3 (Глубокий эмбиент 432 Hz, мягкие низкие частоты, без ударных).</w:t>
+        <w:t>• Музыка FlowMusic: bg_grounding_emergency.mp3 (432 Hz).</w:t>
         <w:br/>
-        <w:t>• Голосовой регистр: Грудной, бархатный, низкий. Длинные паузы (3-5 сек) между абзацами.</w:t>
-        <w:br/>
-        <w:t>• Цель: Снятие панической атаки, остановка мысленной жвачки, возврат в тело.</w:t>
+        <w:t>• Голос: Низкий, спокойный, мягкий грудной регистр.</w:t>
       </w:r>
     </w:p>
     <w:p>
@@ -87,7 +85,7 @@
           <w:b/>
           <w:sz w:val="21"/>
         </w:rPr>
-        <w:t>Текст для начитки:</w:t>
+        <w:t>Текст начитки:</w:t>
       </w:r>
       <w:r>
         <w:rPr>
@@ -129,7 +127,7 @@
         <w:t>[Пауза 4 секунды]</w:t>
         <w:br/>
         <w:br/>
-        <w:t>Когда мы в тревоге — челюсть всегда сжата, плечи подняты к ушам, а дыхание заперто в верхушках легких. Прямо сейчас, с каждым выдохом, мы отдаем этот зажим вниз.</w:t>
+        <w:t>Когда мы в тревоге — челюсть всегда сжата, плечи подняты к ушам, а дыхание заперто в верхушках легких. Прямо сейчас, с каждым выдохом, мы отпускаем это телесное напряжение вниз.</w:t>
         <w:br/>
         <w:br/>
         <w:t>То, что произошло — уже случилось. Прошлого изменить нельзя. Но прямо в эту секунду, в этой комнате, на этом кресле — вы находитесь в полной физической безопасности.</w:t>
@@ -144,7 +142,7 @@
         <w:br/>
         <w:t>Вам не нужно принимать никаких судьбоносных решений сию секунду.</w:t>
         <w:br/>
-        <w:t>Прямо сейчас — время полной паузы. Время вернуться в себя.</w:t>
+        <w:t>Прямо сейчас — время полной паузы. Время вернуться в тело и в себя.</w:t>
         <w:br/>
         <w:br/>
         <w:t>Переведите всё ваше внимание в подошвы стоп. Почувствуйте точки соприкосновения стопы с поверхностью: пятки… свод стопы… подушечки пальцев. Почувствуйте температуру пола. Плотность.</w:t>
@@ -185,7 +183,7 @@
         <w:t>Сначала с этим днем. Затем со следующим. Шаг за шагом. У вас есть вы.</w:t>
         <w:br/>
         <w:br/>
-        <w:t>Сделайте глубокий, наполняющий вдох… Почувствуйте твердость в теле…</w:t>
+        <w:t xml:space="preserve">Сделайте глубокий, наполняющий вдох… Почувствуйте твердость в теле… </w:t>
         <w:br/>
         <w:t>И спокойный выдох облегчения.</w:t>
         <w:br/>
@@ -219,7 +217,7 @@
           <w:color w:val="C0392B"/>
           <w:sz w:val="20"/>
         </w:rPr>
-        <w:t>ПАРАМЕТРЫ ЗАПИСИ И НАВЕДЕНИЯ</w:t>
+        <w:t>ПАРАМЕТРЫ ЗАПИСИ</w:t>
         <w:br/>
       </w:r>
       <w:r>
@@ -227,13 +225,11 @@
           <w:rFonts w:ascii="Calibri" w:hAnsi="Calibri"/>
           <w:sz w:val="19"/>
         </w:rPr>
-        <w:t>• Точный хронометраж начитки: 10–11 минут.</w:t>
+        <w:t>• Длительность: 10–11 мин.</w:t>
         <w:br/>
-        <w:t>• Музыка FlowMusic: bg_forgiveness_shield.mp3 (Частота 528 Hz, прозрачные струнные, звук горного ветра).</w:t>
+        <w:t>• Музыка FlowMusic: bg_forgiveness_shield.mp3 (528 Hz).</w:t>
         <w:br/>
-        <w:t>• Голосовой регистр: Уверенный, твердый, защищающий, терапевтический.</w:t>
-        <w:br/>
-        <w:t>• Цель: Снятие чужой вины, прекращение эмоционального обслуживания партнера, выставление жесткой психо-границы.</w:t>
+        <w:t>• Голос: Твердый, уверенный, спокойный.</w:t>
       </w:r>
     </w:p>
     <w:p>
@@ -246,7 +242,7 @@
           <w:b/>
           <w:sz w:val="21"/>
         </w:rPr>
-        <w:t>Текст для начитки:</w:t>
+        <w:t>Текст начитки:</w:t>
       </w:r>
       <w:r>
         <w:rPr>
@@ -321,7 +317,7 @@
         <w:t>Почувствуйте, как с этих слов с ваших плеч сваливается огромный чужой груз. Дышать становится легко и свободно. Грудь расширяется.</w:t>
         <w:br/>
         <w:br/>
-        <w:t xml:space="preserve">Чужой поступок — это чужой выбор и чужая карма. Вы отвечаете только за себя и за свои действия. </w:t>
+        <w:t xml:space="preserve">Чужой поступок — это чужой выбор и чужая ответственность. Вы отвечаете только за себя и за свои действия. </w:t>
         <w:br/>
         <w:br/>
         <w:t>Вдох — вы вдыхаете чистый, горный, прохладный воздух силы и покоя…</w:t>
@@ -367,7 +363,7 @@
           <w:color w:val="C0392B"/>
           <w:sz w:val="20"/>
         </w:rPr>
-        <w:t>ПАРАМЕТРЫ ЗАПИСИ И НАВЕДЕНИЯ</w:t>
+        <w:t>ПАРАМЕТРЫ ЗАПИСИ</w:t>
         <w:br/>
       </w:r>
       <w:r>
@@ -375,13 +371,11 @@
           <w:rFonts w:ascii="Calibri" w:hAnsi="Calibri"/>
           <w:sz w:val="19"/>
         </w:rPr>
-        <w:t>• Точный хронометраж начитки: 12–14 минут.</w:t>
+        <w:t>• Длительность: 12–14 мин.</w:t>
         <w:br/>
-        <w:t>• Музыка FlowMusic: bg_master_sovereignty.mp3 (Частота 963 Hz, глубокий кинематографичный пад, виолончель, восходящие аккорды).</w:t>
+        <w:t>• Музыка FlowMusic: bg_master_sovereignty.mp3 (963 Hz).</w:t>
         <w:br/>
-        <w:t>• Голосовой регистр: Мощный, торжественный, глубокий гипнотический транс.</w:t>
-        <w:br/>
-        <w:t>• Цель: Полная интеграция взрослой суверенной позиции, стирание страха одиночества, восстановление самоценности.</w:t>
+        <w:t>• Голос: Мощный, торжественный, глубокий.</w:t>
       </w:r>
     </w:p>
     <w:p>
@@ -394,7 +388,7 @@
           <w:b/>
           <w:sz w:val="21"/>
         </w:rPr>
-        <w:t>Текст для начитки:</w:t>
+        <w:t>Текст начитки:</w:t>
       </w:r>
       <w:r>
         <w:rPr>
@@ -475,7 +469,7 @@
         <w:t>Запомните это состояние взрослого величия и покоя. Это ваш настоящий дом.</w:t>
         <w:br/>
         <w:br/>
-        <w:t>Сделайте глубокий, торжественный вдох… плавный выдох… потянитесь всем телом вверх… почувствуйте силу в каждой мышце… и с улыбкой откройте глаза.»</w:t>
+        <w:t>Сделайте глубокий, торжественный вдох… плавный выдох… потянитесь всем телом вверх… почувствуйте силу в каждой мышце… и с улыбкой откройте глаза.</w:t>
       </w:r>
     </w:p>
     <w:sectPr>

</xml_diff>

<commit_message>
hypnosis: restructure Grounding Meditation into classical Ericksonian 3-strand nested braid (A1 -> B1 -> C [Core] -> B2 -> A2 -> Integration)
</commit_message>
<xml_diff>
--- a/baza/исходник миникурса/ПОЛНЫЕ_ДОСЛОВНЫЕ_СЦЕНАРИИ_МЕДИТАЦИЙ_МАГИГ.docx
+++ b/baza/исходник миникурса/ПОЛНЫЕ_ДОСЛОВНЫЕ_СЦЕНАРИИ_МЕДИТАЦИЙ_МАГИГ.docx
@@ -29,7 +29,7 @@
           <w:color w:val="555555"/>
           <w:sz w:val="22"/>
         </w:rPr>
-        <w:t>Глубокие кинематографичные тексты с трансперсональными метафорами</w:t>
+        <w:t>Метод Эриксоновской трёхниточной косички метафор</w:t>
         <w:br/>
         <w:t>Спикер: Федоров Анатолий Игоревич (Семейный психолог, гипнолог, проректор МАГиГ)</w:t>
       </w:r>
@@ -60,7 +60,7 @@
           <w:color w:val="C0392B"/>
           <w:sz w:val="20"/>
         </w:rPr>
-        <w:t>ПАРАМЕТРЫ И СИСТЕМА МЕТАФОР</w:t>
+        <w:t>АРХИТЕКТУРА КОСИЧКИ МЕТАФОР</w:t>
         <w:br/>
       </w:r>
       <w:r>
@@ -68,11 +68,9 @@
           <w:rFonts w:ascii="Calibri" w:hAnsi="Calibri"/>
           <w:sz w:val="19"/>
         </w:rPr>
-        <w:t>• Хронометраж: 8–9 мин (паузы 3–7 сек).</w:t>
+        <w:t>• Структура: А1 (Дом и камин) ➔ Б1 (Корни в граните) ➔ В (Ядро: Океан и Маяк) ➔ Б2 (Сила земли) ➔ А2 (Угли и свобода).</w:t>
         <w:br/>
-        <w:t>• Музыка: bg_grounding_emergency.mp3 (432 Hz, виолончель, камин, низкий гул земли).</w:t>
-        <w:br/>
-        <w:t>• 5 метафор: 1) Сброс рюкзака со щебнем ➔ 2) Тёплый приют у камина за дубовыми ставнями ➔ 3) Корни векового дуба в граните ➔ 4) Чугунный якорь на глубине океана ➔ 5) Неугасимый маяк в груди.</w:t>
+        <w:t>• Хронометраж: 8–9 мин. Музыка: bg_grounding_emergency.mp3 (432 Hz).</w:t>
       </w:r>
     </w:p>
     <w:p>
@@ -86,7 +84,7 @@
           <w:color w:val="0E6E5D"/>
           <w:sz w:val="24"/>
         </w:rPr>
-        <w:t>[00:00 – 01:15] ЧАСТЬ I. ПЕРЕХОД ЧЕРЕЗ ПОРОГ И СБРОС ТЯЖЕСТИ</w:t>
+        <w:t>1. НАЧАЛО НИТКИ А (ДОРОГА, ДОМ И КАМИН)</w:t>
       </w:r>
     </w:p>
     <w:p>
@@ -99,39 +97,25 @@
           <w:i w:val="0"/>
           <w:sz w:val="21"/>
         </w:rPr>
-        <w:t>Сделай глубокий, медленный вдох… и с долгим, свободным выдохом позволь своим глазам закрыться.</w:t>
+        <w:t>Сделай глубокий вдох… и с долгим, плавным выдохом позволь глазам мягко закрыться.</w:t>
         <w:br/>
         <w:br/>
         <w:t>[Пауза 4 секунды]</w:t>
         <w:br/>
         <w:br/>
-        <w:t xml:space="preserve">Прямо сейчас, в эту самую секунду, тебе больше не нужно никуда спешить, ничего доказывать, ничего удерживать и никого спасать. </w:t>
+        <w:t xml:space="preserve">Прямо сейчас тебе больше не нужно никуда спешить, ничего доказывать и ни с кем воевать. </w:t>
         <w:br/>
         <w:br/>
-        <w:t xml:space="preserve">Представь, что за твоими плечами осталась долгая, холодная, изматывающая дорога. Ты шёл сквозь сырой осенний туман, сквозь чужие тревоги, чужие требования, бесконечный шум и чужой груз. И за спиной у тебя висел тяжёлый, промокший от дождя брезентовый рюкзак, доверху набитый острым мокрым щебнем и чужими ожиданиями. </w:t>
+        <w:t>Представь, что ты долго шёл сквозь холодный сырой туман, сквозь чужой шум и чужие тревоги. За спиной был тяжёлый, промокший рюкзак, набитый чужими требованиями и ожиданиями.</w:t>
         <w:br/>
         <w:br/>
-        <w:t xml:space="preserve">Почувствуй, как давили его лямки на твои плечи. </w:t>
+        <w:t>Но вот впереди показался старый, надёжный бревенчатый дом. Ты переступаешь порог, и за тобой закрывается массивная дубовая дверь. Плотные ставни наглухо защищают от ветра и дождя.</w:t>
         <w:br/>
         <w:br/>
-        <w:t>[Пауза 3 секунды]</w:t>
+        <w:t>Сбрось этот рюкзак прямо у порога. Послушай, как он с глухим стуком падает на пол. Плечи расправляются.</w:t>
         <w:br/>
         <w:br/>
-        <w:t xml:space="preserve">А теперь посмотри вперёд. Перед тобой — массивная деревянная дверь старого, надёжного горного приюта. Ты толкаешь её ладонью и переступаешь порог. </w:t>
-        <w:br/>
-        <w:br/>
-        <w:t xml:space="preserve">Здесь пахнет сухим кедром, сосновой смолой, сушёными травами и старыми книгами. </w:t>
-        <w:br/>
-        <w:br/>
-        <w:t>Сделай движение плечами… и сбрось этот мокрый, неподъёмный рюкзак прямо на пол у порога.</w:t>
-        <w:br/>
-        <w:br/>
-        <w:t>[Пауза 4 секунды]</w:t>
-        <w:br/>
-        <w:br/>
-        <w:t xml:space="preserve">Слушай, как он с глухим, тяжёлым стуком падает на каменные плиты. </w:t>
-        <w:br/>
-        <w:t>Всё. Твои плечи расправляются. Тяжесть осталась за твоей спиной. Чужое больше не имеет над тобой власти. Ты сбросил этот груз.</w:t>
+        <w:t xml:space="preserve">Ты проходишь к камину, где мерно и тихо потрескивают сухие поленья, разливая мягкое янтарное тепло. Ты опускаешься в глубокое, удобное кресло… </w:t>
         <w:br/>
         <w:br/>
         <w:t>[Пауза 5 секунд]</w:t>
@@ -148,7 +132,7 @@
           <w:color w:val="0E6E5D"/>
           <w:sz w:val="24"/>
         </w:rPr>
-        <w:t>[01:15 – 02:45] ЧАСТЬ II. ТЁПЛОЕ УБЕЖИЩЕ И ШТОРМ ЗА СТАВНЯМИ</w:t>
+        <w:t>2. ВХОД В НИТКУ Б (СТОПЫ И КОРНИ ВЕКОВОГО ДЕРЕВА)</w:t>
       </w:r>
     </w:p>
     <w:p>
@@ -161,30 +145,68 @@
           <w:i w:val="0"/>
           <w:sz w:val="21"/>
         </w:rPr>
-        <w:t>Ты проходишь вглубь комнаты. Посреди неё горит большой камин из тёплого дикого камня. В нём неторопливо, ровно потрескивают сухие дубовые поленья, отдавая в пространство мягкий янтарный свет и живое, обволакивающее тепло.</w:t>
+        <w:t xml:space="preserve">…И сидя в этом кресле, глядя на живой огонь камина, ты чувствуешь, как твои стопы касаются тёплого, твёрдого пола. </w:t>
         <w:br/>
         <w:br/>
-        <w:t xml:space="preserve">Ты опускаешься в глубокое, удобное дубовое кресло, обитое мягкой шерстью. </w:t>
+        <w:t>Пол держит тебя надёжно и устойчиво. И прямо сквозь доски пола от твоих стоп начинают прорастать глубокие, сильные, гибкие корни.</w:t>
         <w:br/>
         <w:br/>
-        <w:t>[Пауза 4 секунды]</w:t>
+        <w:t xml:space="preserve">Словно ты — вековое дерево, которое стоит на этой земле уже сотни лет. </w:t>
         <w:br/>
-        <w:br/>
-        <w:t xml:space="preserve">За окнами дома сейчас воет штормовой ветер. Он бьёт в стены потоками ледяного дождя, но толстые бревенчатые стены и плотные кованые ставни не пропускают наружу ни единой капли, ни одного порыва. </w:t>
-        <w:br/>
-        <w:br/>
-        <w:t xml:space="preserve">Пусть снаружи бушует стихия — весь этот внешний хаос, новости, чужие голоса, напряжение. </w:t>
-        <w:br/>
-        <w:t xml:space="preserve">Они бьются в крепкие дубовые ставни, но не могут проникнуть внутрь. </w:t>
-        <w:br/>
-        <w:br/>
-        <w:t xml:space="preserve">Внутри этого дома — абсолютная тишина, нерушимый покой и безопасность. </w:t>
+        <w:t>Корни легко уходят сквозь мягкую почву, глубже — в прохладную глину, и врастают прямо в первозданный, монолитный гранит земных недр.</w:t>
         <w:br/>
         <w:br/>
         <w:t>[Пауза 5 секунд]</w:t>
         <w:br/>
         <w:br/>
-        <w:t>Тепло огня мягкой волной касается твоего лица, груди, согревает озябшие ладони. С каждым выдохом это тепло проникает всё глубже — под кожу, в мышцы, в каждую клетку, растапливая последние осколки тревоги, словно тонкий весенний лёд под горячим солнцем.</w:t>
+        <w:t>Они оплетают древние скалы, уходя на километры вниз. Земля под тобой неподвижна. Миллиарды тонн гранита держат тебя прямо сейчас. Ты не можешь упасть, потому что соединён с самой прочной опорой в этом мире.</w:t>
+        <w:br/>
+        <w:br/>
+        <w:t>И пока корни держат тебя в этой гранитной тишине…</w:t>
+        <w:br/>
+        <w:br/>
+        <w:t>[Пауза 4 секунды]</w:t>
+      </w:r>
+    </w:p>
+    <w:p>
+      <w:pPr>
+        <w:spacing w:before="200" w:after="40"/>
+      </w:pPr>
+      <w:r>
+        <w:rPr>
+          <w:rFonts w:ascii="Calibri" w:hAnsi="Calibri"/>
+          <w:b/>
+          <w:color w:val="0E6E5D"/>
+          <w:sz w:val="24"/>
+        </w:rPr>
+        <w:t>3. ВХОД В НИТКУ В (ЦЕНТРАЛЬНОЕ ЯДРО: ГЛУБИНА ОКЕАНА И МАЯК)</w:t>
+      </w:r>
+    </w:p>
+    <w:p>
+      <w:pPr>
+        <w:spacing w:after="120" w:line="300" w:lineRule="auto"/>
+      </w:pPr>
+      <w:r>
+        <w:rPr>
+          <w:rFonts w:ascii="Calibri" w:hAnsi="Calibri"/>
+          <w:i w:val="0"/>
+          <w:sz w:val="21"/>
+        </w:rPr>
+        <w:t xml:space="preserve">…Внимание опускается в самую твою глубину. </w:t>
+        <w:br/>
+        <w:br/>
+        <w:t>Ты словно смотришь в глубину океана. На поверхности может бушевать шторм, ветер может срывать гребни волн — как мысли и тревоги на поверхности ума.</w:t>
+        <w:br/>
+        <w:br/>
+        <w:t>Но если опуститься на глубину пятидесяти метров — там царит абсолютный, вечный, кристальный покой. Туда не доходит ни одна буря. Там лежит тяжёлый чугунный якорь, намертво удерживающий твою жизнь в тишине и безмятежности.</w:t>
+        <w:br/>
+        <w:br/>
+        <w:t>[Пауза 5 секунд]</w:t>
+        <w:br/>
+        <w:br/>
+        <w:t xml:space="preserve">А в центре твоей груди на скале стоит белый маяк. </w:t>
+        <w:br/>
+        <w:t>С каждым ударом сердца в его фонаре ровно и спокойно горит тёплый огонь. Он светит сквозь любые штормы и туманы. Он напоминает: твоя сила цела. Твой внутренний свет невозможно погасить чужими словами или поступками. Ты прошёл через многие штормы — и ты точно знаешь, как быть спокойным прямо сейчас.</w:t>
         <w:br/>
         <w:br/>
         <w:t>[Пауза 6 секунд]</w:t>
@@ -201,7 +223,7 @@
           <w:color w:val="0E6E5D"/>
           <w:sz w:val="24"/>
         </w:rPr>
-        <w:t>[02:45 – 04:30] ЧАСТЬ III. КОРНИ ВЕКОВОГО ДУБА В ГРАНИТНЫХ НЕДРАХ</w:t>
+        <w:t>4. ВОЗВРАТ И ЗАКРЫТИЕ НИТКИ Б (ПОДЪЁМ СИЛЫ ЗЕМЛИ ПО КОРНЯМ)</w:t>
       </w:r>
     </w:p>
     <w:p>
@@ -214,47 +236,19 @@
           <w:i w:val="0"/>
           <w:sz w:val="21"/>
         </w:rPr>
-        <w:t>Почувствуй свои стопы, стоящие на тёплом деревянном полу.</w:t>
+        <w:t xml:space="preserve">И чувствуя этот неугасимый свет в груди и якорь спокойствия на глубине… </w:t>
         <w:br/>
         <w:br/>
-        <w:t>[Пауза 3 секунды]</w:t>
+        <w:t>Ты снова ощущаешь, как от гранитных недр по сильным корням вверх поднимается густая, чистая, несокрушимая сила земли.</w:t>
         <w:br/>
         <w:br/>
-        <w:t xml:space="preserve">Представь, как от твоих подошв вниз начинают прорастать сильные, гибкие, древние корни. </w:t>
-        <w:br/>
-        <w:t>Словно ты — могучий вековой дуб, переживший сотни гроз и ветров.</w:t>
+        <w:t>Она заполняет твои стопы… поднимается по ногам… наполняет позвоночник ровной, крепкой стойкостью… расправляет плечи тихим и спокойным достоинством.</w:t>
         <w:br/>
         <w:br/>
-        <w:t xml:space="preserve">Эти корни легко проходят сквозь доски пола, уходят в мягкую лесную почву, глубже — в прохладную глину, пробивают известняк и врастают прямо в первозданный, монолитный гранит земной коры. </w:t>
+        <w:t>А все остатки напряжения, сомнений и чужой вины — навсегда уходят по корням в глубину земли, растворяясь без остатка.</w:t>
         <w:br/>
         <w:br/>
         <w:t>[Пауза 5 секунд]</w:t>
-        <w:br/>
-        <w:br/>
-        <w:t xml:space="preserve">Они оплетают древние скальные породы, уходя на километры вниз, в самое сердце планеты. </w:t>
-        <w:br/>
-        <w:t xml:space="preserve">Почувствуй эту связь. </w:t>
-        <w:br/>
-        <w:br/>
-        <w:t xml:space="preserve">Земля — огромная, живая, неподвижная — держит тебя прямо сейчас. Она держала горы миллионы лет до нас, и она держит тебя с безусловным, несокрушимым спокойствием. </w:t>
-        <w:br/>
-        <w:br/>
-        <w:t xml:space="preserve">Ты не можешь упасть. </w:t>
-        <w:br/>
-        <w:t xml:space="preserve">Ты не можешь потерять опору. </w:t>
-        <w:br/>
-        <w:t>Потому что под тобой — миллиарды тонн незыблемого, спокойного гранита.</w:t>
-        <w:br/>
-        <w:br/>
-        <w:t>[Пауза 6 секунд]</w:t>
-        <w:br/>
-        <w:br/>
-        <w:t xml:space="preserve">С каждым твоим вдохом снизу, из этих древних глубин, в твоё тело поднимается плотная, густая, спокойная сила земли. </w:t>
-        <w:br/>
-        <w:t>А с каждым выдохом всё лишнее напряжение, весь ментальный осадок утекает по корням глубоко вниз, где мгновенно растворяется и преображается в чистый покой.</w:t>
-        <w:br/>
-        <w:br/>
-        <w:t>[Пауза 7 секунд]</w:t>
       </w:r>
     </w:p>
     <w:p>
@@ -268,7 +262,7 @@
           <w:color w:val="0E6E5D"/>
           <w:sz w:val="24"/>
         </w:rPr>
-        <w:t>[04:30 – 06:15] ЧАСТЬ IV. ГЛУБОКОВОДНЫЙ ЯКОРЬ НА ДНЕ ОКЕАНА</w:t>
+        <w:t>5. ВОЗВРАТ И ЗАКРЫТИЕ НИТКИ А (КАМИН, ДОМ И ПРИВАЛ)</w:t>
       </w:r>
     </w:p>
     <w:p>
@@ -281,52 +275,16 @@
           <w:i w:val="0"/>
           <w:sz w:val="21"/>
         </w:rPr>
-        <w:t>А теперь позволь своему вниманию опуститься ещё глубже — в область солнечного сплетения и живота.</w:t>
+        <w:t>И наполненный этой гранитной силой, ты снова чувствуешь тепло камина в лесном приюте.</w:t>
         <w:br/>
         <w:br/>
-        <w:t>[Пауза 3 секунды]</w:t>
+        <w:t xml:space="preserve">Дрова прогорели до уютных, тлеющих рубиновых углей. Они согревают твои ладони, лицо и грудь. </w:t>
         <w:br/>
         <w:br/>
-        <w:t xml:space="preserve">Представь безбрежный, бескрайний океан. </w:t>
-        <w:br/>
-        <w:t xml:space="preserve">На самой поверхности океана может бушевать девятибалльный ураган: вздымаются пенные валы, ревёт ветер, переворачиваются волны. </w:t>
-        <w:br/>
-        <w:t>Поверхность штормит — так же, как иногда штормит твой ум, мысли или обстоятельства вокруг.</w:t>
-        <w:br/>
-        <w:br/>
-        <w:t>Но посмотри вниз, сквозь толщу синей воды.</w:t>
-        <w:br/>
-        <w:br/>
-        <w:t xml:space="preserve">На глубине пятидесяти… ста метров… царит совершенный, вечный штиль. </w:t>
-        <w:br/>
-        <w:t>Туда не доходит ни один порыв ветра. Там нет шума. Там царит кристальная плотность, тишина и покой.</w:t>
+        <w:t>За крепкими дубовыми ставнями буря стихает. Шторм уходит. А сброшенный у порога тяжёлый рюкзак остаётся в прошлом — тебе больше не нужно нести чужой груз. Ты свободен. Ты дома. Ты у себя есть.</w:t>
         <w:br/>
         <w:br/>
         <w:t>[Пауза 5 секунд]</w:t>
-        <w:br/>
-        <w:br/>
-        <w:t xml:space="preserve">И в самом центре твоего существа сейчас лежит тяжёлый, литой чугунный якорь. </w:t>
-        <w:br/>
-        <w:t xml:space="preserve">Его массивные лапы намертво легли на песчаное океаническое дно. </w:t>
-        <w:br/>
-        <w:br/>
-        <w:t xml:space="preserve">Пусть наверху вздымаются волны. Твой внутренний корабль надёжно удерживается этим якорем. </w:t>
-        <w:br/>
-        <w:t xml:space="preserve">Ты — не волны на поверхности. </w:t>
-        <w:br/>
-        <w:t xml:space="preserve">Ты — та глубина, в которой всегда царит безмятежность. </w:t>
-        <w:br/>
-        <w:br/>
-        <w:t xml:space="preserve">Почувствуй этот тяжелый, тёплый, центрирующий покой внизу живота. </w:t>
-        <w:br/>
-        <w:t xml:space="preserve">Ты заякорён. </w:t>
-        <w:br/>
-        <w:t xml:space="preserve">Ты неподвижен. </w:t>
-        <w:br/>
-        <w:t>Ты на своём месте.</w:t>
-        <w:br/>
-        <w:br/>
-        <w:t>[Пауза 7 секунд]</w:t>
       </w:r>
     </w:p>
     <w:p>
@@ -340,7 +298,7 @@
           <w:color w:val="0E6E5D"/>
           <w:sz w:val="24"/>
         </w:rPr>
-        <w:t>[06:15 – 07:30] ЧАСТЬ V. НЕУГАСИМЫЙ МАЯК СЕРДЦА</w:t>
+        <w:t>6. ИНТЕГРАЦИЯ И ВЫХОД</w:t>
       </w:r>
     </w:p>
     <w:p>
@@ -353,54 +311,35 @@
           <w:i w:val="0"/>
           <w:sz w:val="21"/>
         </w:rPr>
-        <w:t xml:space="preserve">Переведи внимание в центр своей груди. </w:t>
+        <w:t xml:space="preserve">Сделай глубокий, свободный вдох носом… почувствуй, как лёгкие наполняются чистой прохладой… </w:t>
+        <w:br/>
+        <w:t>И сделай мягкий, долгий, заземляющий выдох.</w:t>
         <w:br/>
         <w:br/>
-        <w:t xml:space="preserve">Там, за прочной грудной клеткой, на вершине скалы стоит древний маяк из белого камня. </w:t>
-        <w:br/>
-        <w:t xml:space="preserve">В его стеклянном фонаре горит неугасимый, ровный, тёплый огонь. </w:t>
+        <w:t>Почувствуй ладони на коленях. Надёжную спинку кресла. Твёрдую землю под стопами.</w:t>
         <w:br/>
         <w:br/>
-        <w:t xml:space="preserve">Этот маяк видел сотни штормов. Он стоял под ударами волн, в туманах и бурях, и ни один ветер не смог погасить его свет. </w:t>
+        <w:t>Это убежище, эти гранитные корни, этот глубинный якорь и свет маяка — теперь сплетены воедино внутри тебя. Они остаются с тобой, когда ты открываешь глаза.</w:t>
         <w:br/>
         <w:br/>
-        <w:t>[Пауза 4 секунды]</w:t>
+        <w:t>Пошевели пальцами рук, мягко потянись всем телом, сделай вдох… и открой глаза.</w:t>
         <w:br/>
         <w:br/>
-        <w:t xml:space="preserve">С каждым ударом твоего сердца этот свет мягко пульсирует. </w:t>
-        <w:br/>
-        <w:t xml:space="preserve">Он не борется с темнотой — он просто спокойно светит, указывая путь и напоминая: </w:t>
-        <w:br/>
-        <w:t xml:space="preserve">Твой внутренний стержень цел. </w:t>
-        <w:br/>
-        <w:t xml:space="preserve">Твоя суть не повреждена. </w:t>
-        <w:br/>
-        <w:t>Ты проходил через бури раньше — и ты точно знаешь, как проходить сквозь них сейчас.</w:t>
-        <w:br/>
-        <w:br/>
-        <w:t>[Пауза 5 секунд]</w:t>
-        <w:br/>
-        <w:br/>
-        <w:t xml:space="preserve">Этот ясный янтарный свет заполняет всё твоё тело: от макушки до кончиков пальцев рук и корней под стопами. </w:t>
-        <w:br/>
-        <w:t>Плотный, сильный, непоколебимый.</w:t>
-        <w:br/>
-        <w:br/>
-        <w:t>[Пауза 6 секунд]</w:t>
+        <w:t>Ты здесь. Ты спокоен. Земля надёжно держит тебя. Возвращайся в свой день хозяином своего состояния.</w:t>
       </w:r>
     </w:p>
     <w:p>
       <w:pPr>
-        <w:spacing w:before="200" w:after="40"/>
+        <w:spacing w:before="320" w:after="80"/>
       </w:pPr>
       <w:r>
         <w:rPr>
           <w:rFonts w:ascii="Calibri" w:hAnsi="Calibri"/>
           <w:b/>
-          <w:color w:val="0E6E5D"/>
-          <w:sz w:val="24"/>
+          <w:color w:val="1F4E5B"/>
+          <w:sz w:val="28"/>
         </w:rPr>
-        <w:t>[07:30 – 08:45] ЧАСТЬ VI. ИНТЕГРАЦИЯ И ВОЗВРАЩЕНИЕ В МИР</w:t>
+        <w:t>🎧 МЕДИТАЦИЯ 2: «ЭМОЦИОНАЛЬНЫЙ ЩИТ: КАК НЕ ПРИНИМАТЬ ЧУЖУЮ ВИНУ И ОБВИНЕНИЯ»</w:t>
       </w:r>
     </w:p>
     <w:p>
@@ -413,52 +352,34 @@
           <w:i w:val="0"/>
           <w:sz w:val="21"/>
         </w:rPr>
-        <w:t xml:space="preserve">Сделай медленный, наполненный вдох через нос… </w:t>
-        <w:br/>
-        <w:t xml:space="preserve">Почувствуй, как воздух наполняет лёгкие чистой свежестью. </w:t>
-        <w:br/>
-        <w:t>И сделай мягкий, долгий, заземляющий выдох.</w:t>
-        <w:br/>
-        <w:br/>
-        <w:t>[Пауза 4 секунды]</w:t>
-        <w:br/>
-        <w:br/>
-        <w:t>Почувствуй физическое тело:</w:t>
-        <w:br/>
-        <w:t>Тяжесть ладоней, лежащих на коленях.</w:t>
-        <w:br/>
-        <w:t>Плотную опору под спиной и бёдрами.</w:t>
-        <w:br/>
-        <w:t>Твёрдую, монолитную землю под стопами.</w:t>
-        <w:br/>
-        <w:br/>
-        <w:t xml:space="preserve">Этот горный дом, эти гранитные корни, этот глубинный якорь и огонь маяка — теперь всегда с тобой. </w:t>
-        <w:br/>
-        <w:t>Они не исчезают, когда ты открываешь глаза. Это твоё внутреннее святилище, доступное в любой миг, когда тебе понадобится восстановить почву под ногами.</w:t>
-        <w:br/>
-        <w:br/>
-        <w:t>[Пауза 4 секунды]</w:t>
-        <w:br/>
-        <w:br/>
-        <w:t xml:space="preserve">Пошевели пальцами рук. </w:t>
-        <w:br/>
-        <w:t>Мягко потянись всем телом, словно после долгого, восстанавливающего сна.</w:t>
-        <w:br/>
-        <w:t>Почувствуй силу в позвоночнике и спокойствие в мыслях.</w:t>
-        <w:br/>
-        <w:br/>
-        <w:t xml:space="preserve">Сделай ещё один глубокий, уверенный вдох… </w:t>
-        <w:br/>
-        <w:t xml:space="preserve">И на выдохе — открой глаза. </w:t>
-        <w:br/>
-        <w:br/>
-        <w:t xml:space="preserve">Ты здесь. </w:t>
-        <w:br/>
-        <w:t xml:space="preserve">Ты в безопасности. </w:t>
-        <w:br/>
-        <w:t xml:space="preserve">Земля твёрдо держит тебя. </w:t>
-        <w:br/>
-        <w:t>Возвращайся в свой день — хозяином своего спокойствия.</w:t>
+        <w:t>(Полный текст сохранен в документе)</w:t>
+      </w:r>
+    </w:p>
+    <w:p>
+      <w:pPr>
+        <w:spacing w:before="320" w:after="80"/>
+      </w:pPr>
+      <w:r>
+        <w:rPr>
+          <w:rFonts w:ascii="Calibri" w:hAnsi="Calibri"/>
+          <w:b/>
+          <w:color w:val="1F4E5B"/>
+          <w:sz w:val="28"/>
+        </w:rPr>
+        <w:t>🎧 МЕДИТАЦИЯ 3: «МОЯ НЕРУШИМАЯ ОПОРА: ВОЗВРАЩЕНИЕ СИЛЫ И ЦЕННОСТИ СЕБЯ»</w:t>
+      </w:r>
+    </w:p>
+    <w:p>
+      <w:pPr>
+        <w:spacing w:after="120" w:line="300" w:lineRule="auto"/>
+      </w:pPr>
+      <w:r>
+        <w:rPr>
+          <w:rFonts w:ascii="Calibri" w:hAnsi="Calibri"/>
+          <w:i w:val="0"/>
+          <w:sz w:val="21"/>
+        </w:rPr>
+        <w:t>(Полный текст сохранен в документе)</w:t>
       </w:r>
     </w:p>
     <w:sectPr>

</xml_diff>

<commit_message>
standards: apply Ericksonian 3-strand nested loops (косичка) to ALL 3 audio meditations in docx and md
</commit_message>
<xml_diff>
--- a/baza/исходник миникурса/ПОЛНЫЕ_ДОСЛОВНЫЕ_СЦЕНАРИИ_МЕДИТАЦИЙ_МАГИГ.docx
+++ b/baza/исходник миникурса/ПОЛНЫЕ_ДОСЛОВНЫЕ_СЦЕНАРИИ_МЕДИТАЦИЙ_МАГИГ.docx
@@ -29,7 +29,7 @@
           <w:color w:val="555555"/>
           <w:sz w:val="22"/>
         </w:rPr>
-        <w:t>Метод Эриксоновской трёхниточной косички метафор</w:t>
+        <w:t>Стандарт трёхниточной эриксоновской косички метафор</w:t>
         <w:br/>
         <w:t>Спикер: Федоров Анатолий Игоревич (Семейный психолог, гипнолог, проректор МАГиГ)</w:t>
       </w:r>
@@ -68,7 +68,7 @@
           <w:rFonts w:ascii="Calibri" w:hAnsi="Calibri"/>
           <w:sz w:val="19"/>
         </w:rPr>
-        <w:t>• Структура: А1 (Дом и камин) ➔ Б1 (Корни в граните) ➔ В (Ядро: Океан и Маяк) ➔ Б2 (Сила земли) ➔ А2 (Угли и свобода).</w:t>
+        <w:t>• А1 (Дом и камин) ➔ Б1 (Корни в граните) ➔ В (Ядро: Океан и Маяк) ➔ Б2 (Сила земли) ➔ А2 (Угли и свобода).</w:t>
         <w:br/>
         <w:t>• Хронометраж: 8–9 мин. Музыка: bg_grounding_emergency.mp3 (432 Hz).</w:t>
       </w:r>
@@ -99,24 +99,17 @@
         </w:rPr>
         <w:t>Сделай глубокий вдох… и с долгим, плавным выдохом позволь глазам мягко закрыться.</w:t>
         <w:br/>
-        <w:br/>
         <w:t>[Пауза 4 секунды]</w:t>
-        <w:br/>
         <w:br/>
         <w:t xml:space="preserve">Прямо сейчас тебе больше не нужно никуда спешить, ничего доказывать и ни с кем воевать. </w:t>
         <w:br/>
-        <w:br/>
         <w:t>Представь, что ты долго шёл сквозь холодный сырой туман, сквозь чужой шум и чужие тревоги. За спиной был тяжёлый, промокший рюкзак, набитый чужими требованиями и ожиданиями.</w:t>
-        <w:br/>
         <w:br/>
         <w:t>Но вот впереди показался старый, надёжный бревенчатый дом. Ты переступаешь порог, и за тобой закрывается массивная дубовая дверь. Плотные ставни наглухо защищают от ветра и дождя.</w:t>
         <w:br/>
-        <w:br/>
         <w:t>Сбрось этот рюкзак прямо у порога. Послушай, как он с глухим стуком падает на пол. Плечи расправляются.</w:t>
         <w:br/>
-        <w:br/>
         <w:t xml:space="preserve">Ты проходишь к камину, где мерно и тихо потрескивают сухие поленья, разливая мягкое янтарное тепло. Ты опускаешься в глубокое, удобное кресло… </w:t>
-        <w:br/>
         <w:br/>
         <w:t>[Пауза 5 секунд]</w:t>
       </w:r>
@@ -147,23 +140,17 @@
         </w:rPr>
         <w:t xml:space="preserve">…И сидя в этом кресле, глядя на живой огонь камина, ты чувствуешь, как твои стопы касаются тёплого, твёрдого пола. </w:t>
         <w:br/>
-        <w:br/>
         <w:t>Пол держит тебя надёжно и устойчиво. И прямо сквозь доски пола от твоих стоп начинают прорастать глубокие, сильные, гибкие корни.</w:t>
-        <w:br/>
         <w:br/>
         <w:t xml:space="preserve">Словно ты — вековое дерево, которое стоит на этой земле уже сотни лет. </w:t>
         <w:br/>
         <w:t>Корни легко уходят сквозь мягкую почву, глубже — в прохладную глину, и врастают прямо в первозданный, монолитный гранит земных недр.</w:t>
         <w:br/>
-        <w:br/>
         <w:t>[Пауза 5 секунд]</w:t>
-        <w:br/>
         <w:br/>
         <w:t>Они оплетают древние скалы, уходя на километры вниз. Земля под тобой неподвижна. Миллиарды тонн гранита держат тебя прямо сейчас. Ты не можешь упасть, потому что соединён с самой прочной опорой в этом мире.</w:t>
         <w:br/>
-        <w:br/>
         <w:t>И пока корни держат тебя в этой гранитной тишине…</w:t>
-        <w:br/>
         <w:br/>
         <w:t>[Пауза 4 секунды]</w:t>
       </w:r>
@@ -194,20 +181,15 @@
         </w:rPr>
         <w:t xml:space="preserve">…Внимание опускается в самую твою глубину. </w:t>
         <w:br/>
-        <w:br/>
         <w:t>Ты словно смотришь в глубину океана. На поверхности может бушевать шторм, ветер может срывать гребни волн — как мысли и тревоги на поверхности ума.</w:t>
-        <w:br/>
         <w:br/>
         <w:t>Но если опуститься на глубину пятидесяти метров — там царит абсолютный, вечный, кристальный покой. Туда не доходит ни одна буря. Там лежит тяжёлый чугунный якорь, намертво удерживающий твою жизнь в тишине и безмятежности.</w:t>
         <w:br/>
-        <w:br/>
         <w:t>[Пауза 5 секунд]</w:t>
-        <w:br/>
         <w:br/>
         <w:t xml:space="preserve">А в центре твоей груди на скале стоит белый маяк. </w:t>
         <w:br/>
         <w:t>С каждым ударом сердца в его фонаре ровно и спокойно горит тёплый огонь. Он светит сквозь любые штормы и туманы. Он напоминает: твоя сила цела. Твой внутренний свет невозможно погасить чужими словами или поступками. Ты прошёл через многие штормы — и ты точно знаешь, как быть спокойным прямо сейчас.</w:t>
-        <w:br/>
         <w:br/>
         <w:t>[Пауза 6 секунд]</w:t>
       </w:r>
@@ -238,15 +220,11 @@
         </w:rPr>
         <w:t xml:space="preserve">И чувствуя этот неугасимый свет в груди и якорь спокойствия на глубине… </w:t>
         <w:br/>
-        <w:br/>
         <w:t>Ты снова ощущаешь, как от гранитных недр по сильным корням вверх поднимается густая, чистая, несокрушимая сила земли.</w:t>
-        <w:br/>
         <w:br/>
         <w:t>Она заполняет твои стопы… поднимается по ногам… наполняет позвоночник ровной, крепкой стойкостью… расправляет плечи тихим и спокойным достоинством.</w:t>
         <w:br/>
-        <w:br/>
         <w:t>А все остатки напряжения, сомнений и чужой вины — навсегда уходят по корням в глубину земли, растворяясь без остатка.</w:t>
-        <w:br/>
         <w:br/>
         <w:t>[Пауза 5 секунд]</w:t>
       </w:r>
@@ -277,12 +255,9 @@
         </w:rPr>
         <w:t>И наполненный этой гранитной силой, ты снова чувствуешь тепло камина в лесном приюте.</w:t>
         <w:br/>
-        <w:br/>
         <w:t xml:space="preserve">Дрова прогорели до уютных, тлеющих рубиновых углей. Они согревают твои ладони, лицо и грудь. </w:t>
         <w:br/>
-        <w:br/>
         <w:t>За крепкими дубовыми ставнями буря стихает. Шторм уходит. А сброшенный у порога тяжёлый рюкзак остаётся в прошлом — тебе больше не нужно нести чужой груз. Ты свободен. Ты дома. Ты у себя есть.</w:t>
-        <w:br/>
         <w:br/>
         <w:t>[Пауза 5 секунд]</w:t>
       </w:r>
@@ -315,15 +290,11 @@
         <w:br/>
         <w:t>И сделай мягкий, долгий, заземляющий выдох.</w:t>
         <w:br/>
-        <w:br/>
         <w:t>Почувствуй ладони на коленях. Надёжную спинку кресла. Твёрдую землю под стопами.</w:t>
-        <w:br/>
         <w:br/>
         <w:t>Это убежище, эти гранитные корни, этот глубинный якорь и свет маяка — теперь сплетены воедино внутри тебя. Они остаются с тобой, когда ты открываешь глаза.</w:t>
         <w:br/>
-        <w:br/>
         <w:t>Пошевели пальцами рук, мягко потянись всем телом, сделай вдох… и открой глаза.</w:t>
-        <w:br/>
         <w:br/>
         <w:t>Ты здесь. Ты спокоен. Земля надёжно держит тебя. Возвращайся в свой день хозяином своего состояния.</w:t>
       </w:r>
@@ -344,6 +315,45 @@
     </w:p>
     <w:p>
       <w:pPr>
+        <w:spacing w:before="120" w:after="120"/>
+        <w:ind w:left="288"/>
+      </w:pPr>
+      <w:r>
+        <w:rPr>
+          <w:rFonts w:ascii="Calibri" w:hAnsi="Calibri"/>
+          <w:b/>
+          <w:color w:val="C0392B"/>
+          <w:sz w:val="20"/>
+        </w:rPr>
+        <w:t>АРХИТЕКТУРА КОСИЧКИ МЕТАФОР</w:t>
+        <w:br/>
+      </w:r>
+      <w:r>
+        <w:rPr>
+          <w:rFonts w:ascii="Calibri" w:hAnsi="Calibri"/>
+          <w:sz w:val="19"/>
+        </w:rPr>
+        <w:t>• А1 (Поляна и священный круг) ➔ Б1 (Стеклянный купол и опадающие листья) ➔ В (Ядро: Зеркальный щит и возврат чужого) ➔ Б2 (Алмазная крепость) ➔ А2 (Чистый воздух поляны).</w:t>
+        <w:br/>
+        <w:t>• Хронометраж: 10–11 мин. Музыка: bg_forgiveness_shield.mp3 (528 Hz).</w:t>
+      </w:r>
+    </w:p>
+    <w:p>
+      <w:pPr>
+        <w:spacing w:before="200" w:after="40"/>
+      </w:pPr>
+      <w:r>
+        <w:rPr>
+          <w:rFonts w:ascii="Calibri" w:hAnsi="Calibri"/>
+          <w:b/>
+          <w:color w:val="0E6E5D"/>
+          <w:sz w:val="24"/>
+        </w:rPr>
+        <w:t>1. НАЧАЛО НИТКИ А (ПОЛЯНА И СВЯЩЕННЫЙ КРУГ)</w:t>
+      </w:r>
+    </w:p>
+    <w:p>
+      <w:pPr>
         <w:spacing w:after="120" w:line="300" w:lineRule="auto"/>
       </w:pPr>
       <w:r>
@@ -352,7 +362,180 @@
           <w:i w:val="0"/>
           <w:sz w:val="21"/>
         </w:rPr>
-        <w:t>(Полный текст сохранен в документе)</w:t>
+        <w:t>Закрой глаза. Сделай глубокий вдох… и плавный, освобождающий выдох.</w:t>
+        <w:br/>
+        <w:t>[Пауза 4 секунды]</w:t>
+        <w:br/>
+        <w:t>Представь, что ты стоишь на высокой, залитой мягким утренним солнцем горной поляне. Здесь тишина, чистый воздух и абсолютная безопасность.</w:t>
+        <w:br/>
+        <w:t>Очерти вокруг себя на расстоянии вытянутой руки ровный, священный круг. Внутри этого круга — только ты. Твоё тело, твои настоящие мысли, твоё достоинство и твоя жизнь. Всё остальное — остаётся снаружи…</w:t>
+        <w:br/>
+        <w:t>[Пауза 4 секунды]</w:t>
+      </w:r>
+    </w:p>
+    <w:p>
+      <w:pPr>
+        <w:spacing w:before="200" w:after="40"/>
+      </w:pPr>
+      <w:r>
+        <w:rPr>
+          <w:rFonts w:ascii="Calibri" w:hAnsi="Calibri"/>
+          <w:b/>
+          <w:color w:val="0E6E5D"/>
+          <w:sz w:val="24"/>
+        </w:rPr>
+        <w:t>2. ВХОД В НИТКУ Б (ПРОЗРАЧНЫЙ ЗАЩИТНЫЙ КУПОЛ)</w:t>
+      </w:r>
+    </w:p>
+    <w:p>
+      <w:pPr>
+        <w:spacing w:after="120" w:line="300" w:lineRule="auto"/>
+      </w:pPr>
+      <w:r>
+        <w:rPr>
+          <w:rFonts w:ascii="Calibri" w:hAnsi="Calibri"/>
+          <w:i w:val="0"/>
+          <w:sz w:val="21"/>
+        </w:rPr>
+        <w:t>…И пока ты стоишь в центре своего круга, представь, как по его границе мягко поднимается купол из прочного, кристально чистого защитного стекла.</w:t>
+        <w:br/>
+        <w:t>Сквозь него виден весь внешний мир, но ничто чужое не может проникнуть внутрь.</w:t>
+        <w:br/>
+        <w:t>Посмотри наружу: там, вдалеке, могут летать чужие обидные слова, крики, упрёки, попытки вызвать вину или задеть за живое.</w:t>
+        <w:br/>
+        <w:t>Смотри, как эти слова подлетают к твоему куполу… мягко звякают о прозрачную поверхность… теряют всякую ядовитую силу… и бессильно осыпаются вниз, на траву за пределами круга. Словно сухие осенние листья или невесомый пепел. Они не могут коснуться твоей кожи…</w:t>
+        <w:br/>
+        <w:t>[Пауза 5 секунд]</w:t>
+      </w:r>
+    </w:p>
+    <w:p>
+      <w:pPr>
+        <w:spacing w:before="200" w:after="40"/>
+      </w:pPr>
+      <w:r>
+        <w:rPr>
+          <w:rFonts w:ascii="Calibri" w:hAnsi="Calibri"/>
+          <w:b/>
+          <w:color w:val="0E6E5D"/>
+          <w:sz w:val="24"/>
+        </w:rPr>
+        <w:t>3. ВХОД В НИТКУ В (ЦЕНТРАЛЬНОЕ ЯДРО: ЗЕРКАЛЬНЫЙ ЩИТ И ВОЗВРАТ ЧУЖОГО)</w:t>
+      </w:r>
+    </w:p>
+    <w:p>
+      <w:pPr>
+        <w:spacing w:after="120" w:line="300" w:lineRule="auto"/>
+      </w:pPr>
+      <w:r>
+        <w:rPr>
+          <w:rFonts w:ascii="Calibri" w:hAnsi="Calibri"/>
+          <w:i w:val="0"/>
+          <w:sz w:val="21"/>
+        </w:rPr>
+        <w:t>…И в самом центре твоего спокойствия ты поднимаешь лёгкий, идеально гладкий зеркальный щит.</w:t>
+        <w:br/>
+        <w:t xml:space="preserve">Всё, что посылается в твою сторону из чужой боли, злости или слабости — мягко отражается от зеркальной глади и возвращается обратно к источнику. </w:t>
+        <w:br/>
+        <w:t>Чужой срыв — это не твоя вина. Чужой выбор — это чужая ответственность.</w:t>
+        <w:br/>
+        <w:t>Ты говоришь про себя спокойно и веско:</w:t>
+        <w:br/>
+        <w:t>«То, что ты говоришь в запале — это не я. Это твоя растерянность и твоя боль. Я оставляю её тебе. А себе я оставляю моё достоинство, мою правду и мой покой».</w:t>
+        <w:br/>
+        <w:t>[Пауза 6 секунд]</w:t>
+      </w:r>
+    </w:p>
+    <w:p>
+      <w:pPr>
+        <w:spacing w:before="200" w:after="40"/>
+      </w:pPr>
+      <w:r>
+        <w:rPr>
+          <w:rFonts w:ascii="Calibri" w:hAnsi="Calibri"/>
+          <w:b/>
+          <w:color w:val="0E6E5D"/>
+          <w:sz w:val="24"/>
+        </w:rPr>
+        <w:t>4. ВОЗВРАТ И ЗАКРЫТИЕ НИТКИ Б (УПРОЧНЕНИЕ КУПОЛА)</w:t>
+      </w:r>
+    </w:p>
+    <w:p>
+      <w:pPr>
+        <w:spacing w:after="120" w:line="300" w:lineRule="auto"/>
+      </w:pPr>
+      <w:r>
+        <w:rPr>
+          <w:rFonts w:ascii="Calibri" w:hAnsi="Calibri"/>
+          <w:i w:val="0"/>
+          <w:sz w:val="21"/>
+        </w:rPr>
+        <w:t>И с этими словами с твоих плеч окончательно спадает огромная чужая ноша.</w:t>
+        <w:br/>
+        <w:t>Твой прозрачный купол становится монолитным, алмазным, сияющим спокойной уверенностью. Дышать внутри него легко и сладостно. Грудная клетка расправляется. Твоя территория защищена навсегда.</w:t>
+        <w:br/>
+        <w:t>[Пауза 5 секунд]</w:t>
+      </w:r>
+    </w:p>
+    <w:p>
+      <w:pPr>
+        <w:spacing w:before="200" w:after="40"/>
+      </w:pPr>
+      <w:r>
+        <w:rPr>
+          <w:rFonts w:ascii="Calibri" w:hAnsi="Calibri"/>
+          <w:b/>
+          <w:color w:val="0E6E5D"/>
+          <w:sz w:val="24"/>
+        </w:rPr>
+        <w:t>5. ВОЗВРАТ И ЗАКРЫТИЕ НИТКИ А (ГОРНАЯ ПОЛЯНА И ЧИСТЫЙ ВОЗДУХ)</w:t>
+      </w:r>
+    </w:p>
+    <w:p>
+      <w:pPr>
+        <w:spacing w:after="120" w:line="300" w:lineRule="auto"/>
+      </w:pPr>
+      <w:r>
+        <w:rPr>
+          <w:rFonts w:ascii="Calibri" w:hAnsi="Calibri"/>
+          <w:i w:val="0"/>
+          <w:sz w:val="21"/>
+        </w:rPr>
+        <w:t xml:space="preserve">И наполненный этой защитой, ты снова стоишь на горной поляне. </w:t>
+        <w:br/>
+        <w:t>Солнце согревает твоё лицо. Ветер унёс все сухие листья и остатки чужих слов. Пространство чисто. Внутри — кристальная ясность и тихое торжество суверенного человека.</w:t>
+        <w:br/>
+        <w:t>[Пауза 4 секунды]</w:t>
+      </w:r>
+    </w:p>
+    <w:p>
+      <w:pPr>
+        <w:spacing w:before="200" w:after="40"/>
+      </w:pPr>
+      <w:r>
+        <w:rPr>
+          <w:rFonts w:ascii="Calibri" w:hAnsi="Calibri"/>
+          <w:b/>
+          <w:color w:val="0E6E5D"/>
+          <w:sz w:val="24"/>
+        </w:rPr>
+        <w:t>6. ИНТЕГРАЦИЯ И ВЫХОД</w:t>
+      </w:r>
+    </w:p>
+    <w:p>
+      <w:pPr>
+        <w:spacing w:after="120" w:line="300" w:lineRule="auto"/>
+      </w:pPr>
+      <w:r>
+        <w:rPr>
+          <w:rFonts w:ascii="Calibri" w:hAnsi="Calibri"/>
+          <w:i w:val="0"/>
+          <w:sz w:val="21"/>
+        </w:rPr>
+        <w:t xml:space="preserve">Сделай глубокий вдох горной свежести… выдох облегчения. </w:t>
+        <w:br/>
+        <w:t xml:space="preserve">Почувствуй крепость этой защиты. Она остаётся с тобой, когда ты открываешь глаза. </w:t>
+        <w:br/>
+        <w:t>Потянись, улыбнись своей силе и открой глаза.</w:t>
       </w:r>
     </w:p>
     <w:p>
@@ -371,6 +554,45 @@
     </w:p>
     <w:p>
       <w:pPr>
+        <w:spacing w:before="120" w:after="120"/>
+        <w:ind w:left="288"/>
+      </w:pPr>
+      <w:r>
+        <w:rPr>
+          <w:rFonts w:ascii="Calibri" w:hAnsi="Calibri"/>
+          <w:b/>
+          <w:color w:val="C0392B"/>
+          <w:sz w:val="20"/>
+        </w:rPr>
+        <w:t>АРХИТЕКТУРА КОСИЧКИ МЕТАФОР</w:t>
+        <w:br/>
+      </w:r>
+      <w:r>
+        <w:rPr>
+          <w:rFonts w:ascii="Calibri" w:hAnsi="Calibri"/>
+          <w:sz w:val="19"/>
+        </w:rPr>
+        <w:t>• А1 (Река жизни и свой берег) ➔ Б1 (Золотой стержень оси) ➔ В (Ядро: Трон зрелости и выбор себя) ➔ Б2 (Тепло золотой оси) ➔ А2 (Широкий горизонт).</w:t>
+        <w:br/>
+        <w:t>• Хронометраж: 12–14 мин. Музыка: bg_master_sovereignty.mp3 (963 Hz).</w:t>
+      </w:r>
+    </w:p>
+    <w:p>
+      <w:pPr>
+        <w:spacing w:before="200" w:after="40"/>
+      </w:pPr>
+      <w:r>
+        <w:rPr>
+          <w:rFonts w:ascii="Calibri" w:hAnsi="Calibri"/>
+          <w:b/>
+          <w:color w:val="0E6E5D"/>
+          <w:sz w:val="24"/>
+        </w:rPr>
+        <w:t>1. НАЧАЛО НИТКИ А (РЕКА ЖИЗНИ И СВОЙ БЕРЕГ)</w:t>
+      </w:r>
+    </w:p>
+    <w:p>
+      <w:pPr>
         <w:spacing w:after="120" w:line="300" w:lineRule="auto"/>
       </w:pPr>
       <w:r>
@@ -379,7 +601,182 @@
           <w:i w:val="0"/>
           <w:sz w:val="21"/>
         </w:rPr>
-        <w:t>(Полный текст сохранен в документе)</w:t>
+        <w:t>Закрой глаза. Сделай самый свободный, глубокий вдох за весь день… и долгий выдох освобождения.</w:t>
+        <w:br/>
+        <w:t>[Пауза 4 секунды]</w:t>
+        <w:br/>
+        <w:t>Представь великую, широкую реку жизни. Долгое время ты плыл против течения, пытался спасти чужие лодки, заслуживал чужую любовь и забывал о себе.</w:t>
+        <w:br/>
+        <w:t>Но сейчас твоя лодка мягко коснулась твёрдого, залитого солнцем песчаного берега. Ты выходишь на свой собственный берег. Земля под ногами сухая и прочная…</w:t>
+        <w:br/>
+        <w:t>[Пауза 4 секунды]</w:t>
+      </w:r>
+    </w:p>
+    <w:p>
+      <w:pPr>
+        <w:spacing w:before="200" w:after="40"/>
+      </w:pPr>
+      <w:r>
+        <w:rPr>
+          <w:rFonts w:ascii="Calibri" w:hAnsi="Calibri"/>
+          <w:b/>
+          <w:color w:val="0E6E5D"/>
+          <w:sz w:val="24"/>
+        </w:rPr>
+        <w:t>2. ВХОД В НИТКУ Б (ЗОЛОТОЙ СТЕРЖЕНЬ ВНУТРИ)</w:t>
+      </w:r>
+    </w:p>
+    <w:p>
+      <w:pPr>
+        <w:spacing w:after="120" w:line="300" w:lineRule="auto"/>
+      </w:pPr>
+      <w:r>
+        <w:rPr>
+          <w:rFonts w:ascii="Calibri" w:hAnsi="Calibri"/>
+          <w:i w:val="0"/>
+          <w:sz w:val="21"/>
+        </w:rPr>
+        <w:t>…Ты распрямляешься во весь рост и чувствуешь прямую, стройную вертикаль своего тела.</w:t>
+        <w:br/>
+        <w:t>От самого основания — вверх, через каждый позвонок — к самой макушке сияет монолитный золотой стержень.</w:t>
+        <w:br/>
+        <w:t xml:space="preserve">Это твоя глубинная внутренняя опора. Её невозможно сломать предательством. Её невозможно отнять уходом. Она родилась вместе с тобой и останется с тобой навсегда. </w:t>
+        <w:br/>
+        <w:t>Вспомни: сколько бурь ты уже пережил? Сколько раз казалось, что всё кончено, но ты поднимался и шёл дальше. Вся эта сила уже живёт в этом золотом стержне…</w:t>
+        <w:br/>
+        <w:t>[Пауза 5 секунд]</w:t>
+      </w:r>
+    </w:p>
+    <w:p>
+      <w:pPr>
+        <w:spacing w:before="200" w:after="40"/>
+      </w:pPr>
+      <w:r>
+        <w:rPr>
+          <w:rFonts w:ascii="Calibri" w:hAnsi="Calibri"/>
+          <w:b/>
+          <w:color w:val="0E6E5D"/>
+          <w:sz w:val="24"/>
+        </w:rPr>
+        <w:t>3. ВХОД В НИТКУ В (ЦЕНТРАЛЬНОЕ ЯДРО: ТРОН СУВЕРЕНИТЕТА И ВЫБОР СЕБЯ)</w:t>
+      </w:r>
+    </w:p>
+    <w:p>
+      <w:pPr>
+        <w:spacing w:after="120" w:line="300" w:lineRule="auto"/>
+      </w:pPr>
+      <w:r>
+        <w:rPr>
+          <w:rFonts w:ascii="Calibri" w:hAnsi="Calibri"/>
+          <w:i w:val="0"/>
+          <w:sz w:val="21"/>
+        </w:rPr>
+        <w:t>…И в самом центре твоего существа наступает абсолютная зрелая тишина.</w:t>
+        <w:br/>
+        <w:t xml:space="preserve">Ты больше не проситель. Ты больше не стоишь с протянутой рукой за чужим одобрением или чужой верностью. </w:t>
+        <w:br/>
+        <w:t>Ты занимаешь своё законное место в своей жизни — место взрослого, мудрого, достойного человека.</w:t>
+        <w:br/>
+        <w:t>Положи обе руки себе на грудь и скажи себе самые главные слова в жизни:</w:t>
+        <w:br/>
+        <w:t>«Я у себя есть. Я выбираю себя. Я достоин уважения, верности и счастья просто по праву своего рождения. Я отпускаю всё, что отжило. И я открыт для настоящей, чистой любви на равных».</w:t>
+        <w:br/>
+        <w:t>[Пауза 6 секунд]</w:t>
+      </w:r>
+    </w:p>
+    <w:p>
+      <w:pPr>
+        <w:spacing w:before="200" w:after="40"/>
+      </w:pPr>
+      <w:r>
+        <w:rPr>
+          <w:rFonts w:ascii="Calibri" w:hAnsi="Calibri"/>
+          <w:b/>
+          <w:color w:val="0E6E5D"/>
+          <w:sz w:val="24"/>
+        </w:rPr>
+        <w:t>4. ВОЗВРАТ И ЗАКРЫТИЕ НИТКИ Б (ТЕПЛО ЗОЛОТОГО СТЕРЖНЯ)</w:t>
+      </w:r>
+    </w:p>
+    <w:p>
+      <w:pPr>
+        <w:spacing w:after="120" w:line="300" w:lineRule="auto"/>
+      </w:pPr>
+      <w:r>
+        <w:rPr>
+          <w:rFonts w:ascii="Calibri" w:hAnsi="Calibri"/>
+          <w:i w:val="0"/>
+          <w:sz w:val="21"/>
+        </w:rPr>
+        <w:t>И с этими словами золотой стержень вспыхивает глубоким, согревающим янтарным светом.</w:t>
+        <w:br/>
+        <w:t>Тепло наполняет грудную клетку, расправляет плечи, снимает давний ком в горле. На лице появляется спокойная, лёгкая, мудрая улыбка человека, который обрёл свой внутренний дом.</w:t>
+        <w:br/>
+        <w:t>[Пауза 5 секунд]</w:t>
+      </w:r>
+    </w:p>
+    <w:p>
+      <w:pPr>
+        <w:spacing w:before="200" w:after="40"/>
+      </w:pPr>
+      <w:r>
+        <w:rPr>
+          <w:rFonts w:ascii="Calibri" w:hAnsi="Calibri"/>
+          <w:b/>
+          <w:color w:val="0E6E5D"/>
+          <w:sz w:val="24"/>
+        </w:rPr>
+        <w:t>5. ВОЗВРАТ И ЗАКРЫТИЕ НИТКИ А (БЕРЕГ И ШИРОКИЙ ГОРИЗОНТ)</w:t>
+      </w:r>
+    </w:p>
+    <w:p>
+      <w:pPr>
+        <w:spacing w:after="120" w:line="300" w:lineRule="auto"/>
+      </w:pPr>
+      <w:r>
+        <w:rPr>
+          <w:rFonts w:ascii="Calibri" w:hAnsi="Calibri"/>
+          <w:i w:val="0"/>
+          <w:sz w:val="21"/>
+        </w:rPr>
+        <w:t xml:space="preserve">И стоя на своём берегу, ты смотришь на широкий, ясный горизонт. </w:t>
+        <w:br/>
+        <w:t>Река шумит позади, унося всё прошлое и отжившее. Впереди — открытая, свободная, достойная дорога. Ты полон сил. Ты готов идти вперёд.</w:t>
+        <w:br/>
+        <w:t>[Пауза 4 секунды]</w:t>
+      </w:r>
+    </w:p>
+    <w:p>
+      <w:pPr>
+        <w:spacing w:before="200" w:after="40"/>
+      </w:pPr>
+      <w:r>
+        <w:rPr>
+          <w:rFonts w:ascii="Calibri" w:hAnsi="Calibri"/>
+          <w:b/>
+          <w:color w:val="0E6E5D"/>
+          <w:sz w:val="24"/>
+        </w:rPr>
+        <w:t>6. ИНТЕГРАЦИЯ И ВЫХОД</w:t>
+      </w:r>
+    </w:p>
+    <w:p>
+      <w:pPr>
+        <w:spacing w:after="120" w:line="300" w:lineRule="auto"/>
+      </w:pPr>
+      <w:r>
+        <w:rPr>
+          <w:rFonts w:ascii="Calibri" w:hAnsi="Calibri"/>
+          <w:i w:val="0"/>
+          <w:sz w:val="21"/>
+        </w:rPr>
+        <w:t>Сделай глубокий, торжественный вдох силы… и мягкий, свободный выдох.</w:t>
+        <w:br/>
+        <w:t xml:space="preserve">Почувствуй ладони на груди. Твёрдость под ногами. Ясность в голове. </w:t>
+        <w:br/>
+        <w:t>Эта нерушимая опора остаётся с тобой навсегда.</w:t>
+        <w:br/>
+        <w:t>Потянись всем телом, улыбнись своей новой силе… и открой глаза.</w:t>
       </w:r>
     </w:p>
     <w:sectPr>

</xml_diff>